<commit_message>
Update experience to 16+ years across resume/portfolio
</commit_message>
<xml_diff>
--- a/Rajesh_Dammala_Cloud-Platform-Engineer_Complete_CV.docx
+++ b/Rajesh_Dammala_Cloud-Platform-Engineer_Complete_CV.docx
@@ -97,7 +97,7 @@
           <w:sz w:val="18"/>
           <w:szCs w:val="18"/>
         </w:rPr>
-        <w:t xml:space="preserve">Cloud Platform &amp; DevOps Engineer with 12+ years architecting, automating, and operating mission-critical, cloud-native infrastructure at hyperscale. Deep, hands-on expertise spanning Public Cloud (AWS preferred; Azure) across IaaS, PaaS, and Serverless; container orchestration with Kubernetes (EKS/AKS/OpenShift), Docker, and ECS; and Infrastructure as Code with Terraform, CloudFormation, and Bicep. Designs reusable frameworks, APIs, CI/CD delivery pipelines, test automation, and infrastructure automation that accelerate enterprise cloud transformation. Proven leader of large-scale infrastructure migration and hybrid-cloud integration, with strong cloud security, networking, and data-engineering foundations. Expert scripter (PowerShell, Python, Bash) who has automated thousands of engineering hours, eliminated 25,000+ incidents, and sustained 100% SLA across 20+ production services. Comfortable in fast-paced, continuous-learning environments and recognized for leading and educating teams on cloud deployment patterns.</w:t>
+        <w:t xml:space="preserve">Cloud Platform &amp; DevOps Engineer with 16+ years architecting, automating, and operating mission-critical, cloud-native infrastructure at hyperscale. Deep, hands-on expertise spanning Public Cloud (AWS preferred; Azure) across IaaS, PaaS, and Serverless; container orchestration with Kubernetes (EKS/AKS/OpenShift), Docker, and ECS; and Infrastructure as Code with Terraform, CloudFormation, and Bicep. Designs reusable frameworks, APIs, CI/CD delivery pipelines, test automation, and infrastructure automation that accelerate enterprise cloud transformation. Proven leader of large-scale infrastructure migration and hybrid-cloud integration, with strong cloud security, networking, and data-engineering foundations. Expert scripter (PowerShell, Python, Bash) who has automated thousands of engineering hours, eliminated 25,000+ incidents, and sustained 100% SLA across 20+ production services. Comfortable in fast-paced, continuous-learning environments and recognized for leading and educating teams on cloud deployment patterns.</w:t>
       </w:r>
     </w:p>
     <w:p>
@@ -130,7 +130,7 @@
           <w:sz w:val="22"/>
           <w:szCs w:val="22"/>
         </w:rPr>
-        <w:t xml:space="preserve">12+  </w:t>
+        <w:t xml:space="preserve">16+  </w:t>
       </w:r>
       <w:r>
         <w:rPr>

</xml_diff>